<commit_message>
publish student projects 2026-07-26 19:53
</commit_message>
<xml_diff>
--- a/Education-Training/pocket-money-academy.docx
+++ b/Education-Training/pocket-money-academy.docx
@@ -2304,7 +2304,7 @@
         <w:pStyle w:val="Compact"/>
       </w:pPr>
       <w:r>
-        <w:t xml:space="preserve">D1 ⭐ Learning Product DD — money-habit objectives for 6–12-year-olds, kid + parent/teacher personas, child-privacy mandate</w:t>
+        <w:t xml:space="preserve">D1 ⭐ Features DD — money-habit objectives for 6–12-year-olds, kid + parent/teacher personas, child-privacy mandate</w:t>
       </w:r>
     </w:p>
     <w:p>
@@ -2328,7 +2328,7 @@
         <w:pStyle w:val="Compact"/>
       </w:pPr>
       <w:r>
-        <w:t xml:space="preserve">TU1 ⭐ UI Standards &amp; Wireframe Baseline — child-first flows plus separate parent/teacher entry</w:t>
+        <w:t xml:space="preserve">U1 ⭐ (UI/UX) UI Standards &amp; Wireframe Baseline — child-first flows plus separate parent/teacher entry</w:t>
       </w:r>
     </w:p>
     <w:p>
@@ -2379,7 +2379,7 @@
         <w:pStyle w:val="Compact"/>
       </w:pPr>
       <w:r>
-        <w:t xml:space="preserve">TU1 ⭐ Functional UI &amp; Usability — Education screens: home/lesson select · in-exercise with pause · Resume/Quit (exact labels, confirmation) · results/progress · settings · how-to-play · separate child and parent/teacher entry points</w:t>
+        <w:t xml:space="preserve">U1 ⭐ (UI/UX) Functional UI &amp; Usability — Education screens: home/lesson select · in-exercise with pause · Resume/Quit (exact labels, confirmation) · results/progress · settings · how-to-play · separate child and parent/teacher entry points</w:t>
       </w:r>
     </w:p>
     <w:p>

</xml_diff>

<commit_message>
publish student projects 2026-07-26 20:37
</commit_message>
<xml_diff>
--- a/Education-Training/pocket-money-academy.docx
+++ b/Education-Training/pocket-money-academy.docx
@@ -2322,18 +2322,6 @@
     <w:p>
       <w:pPr>
         <w:numPr>
-          <w:ilvl w:val="1"/>
-          <w:numId w:val="1019"/>
-        </w:numPr>
-        <w:pStyle w:val="Compact"/>
-      </w:pPr>
-      <w:r>
-        <w:t xml:space="preserve">U1 ⭐ (UI/UX) UI Standards &amp; Wireframe Baseline — child-first flows plus separate parent/teacher entry</w:t>
-      </w:r>
-    </w:p>
-    <w:p>
-      <w:pPr>
-        <w:numPr>
           <w:ilvl w:val="0"/>
           <w:numId w:val="1018"/>
         </w:numPr>
@@ -2355,7 +2343,7 @@
         <w:pStyle w:val="Compact"/>
       </w:pPr>
       <w:r>
-        <w:t xml:space="preserve">D1 ⭐ UX validation with real learners where possible; final polished UI</w:t>
+        <w:t xml:space="preserve">D1 ⭐ Features Design Iteration &amp; Showcase Readiness — FDD updated from kid/parent playtests, changes documented, showcase lesson flow designed</w:t>
       </w:r>
     </w:p>
     <w:p>
@@ -2373,18 +2361,6 @@
     <w:p>
       <w:pPr>
         <w:numPr>
-          <w:ilvl w:val="1"/>
-          <w:numId w:val="1020"/>
-        </w:numPr>
-        <w:pStyle w:val="Compact"/>
-      </w:pPr>
-      <w:r>
-        <w:t xml:space="preserve">U1 ⭐ (UI/UX) Functional UI &amp; Usability — Education screens: home/lesson select · in-exercise with pause · Resume/Quit (exact labels, confirmation) · results/progress · settings · how-to-play · separate child and parent/teacher entry points</w:t>
-      </w:r>
-    </w:p>
-    <w:p>
-      <w:pPr>
-        <w:numPr>
           <w:ilvl w:val="0"/>
           <w:numId w:val="1018"/>
         </w:numPr>
@@ -2394,6 +2370,72 @@
         <w:rPr>
           <w:b/>
         </w:rPr>
+        <w:t xml:space="preserve">UI/UX M1:</w:t>
+      </w:r>
+    </w:p>
+    <w:p>
+      <w:pPr>
+        <w:numPr>
+          <w:ilvl w:val="1"/>
+          <w:numId w:val="1021"/>
+        </w:numPr>
+        <w:pStyle w:val="Compact"/>
+      </w:pPr>
+      <w:r>
+        <w:t xml:space="preserve">U1 ⭐ UI Standards &amp; Wireframe Baseline — child-first flows plus separate parent/teacher entry</w:t>
+      </w:r>
+    </w:p>
+    <w:p>
+      <w:pPr>
+        <w:numPr>
+          <w:ilvl w:val="0"/>
+          <w:numId w:val="1018"/>
+        </w:numPr>
+        <w:pStyle w:val="Compact"/>
+      </w:pPr>
+      <w:r>
+        <w:rPr>
+          <w:b/>
+        </w:rPr>
+        <w:t xml:space="preserve">UI/UX M2:</w:t>
+      </w:r>
+    </w:p>
+    <w:p>
+      <w:pPr>
+        <w:numPr>
+          <w:ilvl w:val="1"/>
+          <w:numId w:val="1022"/>
+        </w:numPr>
+        <w:pStyle w:val="Compact"/>
+      </w:pPr>
+      <w:r>
+        <w:t xml:space="preserve">U1 ⭐ Functional UI &amp; Usability — Education screens: home/lesson select · in-exercise with pause · Resume/Quit (exact labels, confirmation) · results/progress · settings · how-to-play · separate child and parent/teacher entry points</w:t>
+      </w:r>
+    </w:p>
+    <w:p>
+      <w:pPr>
+        <w:numPr>
+          <w:ilvl w:val="1"/>
+          <w:numId w:val="1022"/>
+        </w:numPr>
+        <w:pStyle w:val="Compact"/>
+      </w:pPr>
+      <w:r>
+        <w:t xml:space="preserve">U2 ⭐ UX Validation &amp; Final Polished UI — validated with real learners where possible; final polish of the child-first UI</w:t>
+      </w:r>
+    </w:p>
+    <w:p>
+      <w:pPr>
+        <w:numPr>
+          <w:ilvl w:val="0"/>
+          <w:numId w:val="1018"/>
+        </w:numPr>
+        <w:pStyle w:val="Compact"/>
+      </w:pPr>
+      <w:r>
+        <w:rPr>
+          <w:b/>
+        </w:rPr>
         <w:t xml:space="preserve">Art M1:</w:t>
       </w:r>
     </w:p>
@@ -2401,7 +2443,7 @@
       <w:pPr>
         <w:numPr>
           <w:ilvl w:val="1"/>
-          <w:numId w:val="1021"/>
+          <w:numId w:val="1023"/>
         </w:numPr>
         <w:pStyle w:val="Compact"/>
       </w:pPr>
@@ -2413,7 +2455,7 @@
       <w:pPr>
         <w:numPr>
           <w:ilvl w:val="1"/>
-          <w:numId w:val="1021"/>
+          <w:numId w:val="1023"/>
         </w:numPr>
         <w:pStyle w:val="Compact"/>
       </w:pPr>
@@ -2440,7 +2482,7 @@
       <w:pPr>
         <w:numPr>
           <w:ilvl w:val="1"/>
-          <w:numId w:val="1022"/>
+          <w:numId w:val="1024"/>
         </w:numPr>
         <w:pStyle w:val="Compact"/>
       </w:pPr>
@@ -2452,7 +2494,7 @@
       <w:pPr>
         <w:numPr>
           <w:ilvl w:val="1"/>
-          <w:numId w:val="1022"/>
+          <w:numId w:val="1024"/>
         </w:numPr>
         <w:pStyle w:val="Compact"/>
       </w:pPr>
@@ -2479,7 +2521,7 @@
       <w:pPr>
         <w:numPr>
           <w:ilvl w:val="1"/>
-          <w:numId w:val="1023"/>
+          <w:numId w:val="1025"/>
         </w:numPr>
         <w:pStyle w:val="Compact"/>
       </w:pPr>
@@ -2506,7 +2548,7 @@
       <w:pPr>
         <w:numPr>
           <w:ilvl w:val="1"/>
-          <w:numId w:val="1024"/>
+          <w:numId w:val="1026"/>
         </w:numPr>
         <w:pStyle w:val="Compact"/>
       </w:pPr>
@@ -2518,7 +2560,7 @@
       <w:pPr>
         <w:numPr>
           <w:ilvl w:val="1"/>
-          <w:numId w:val="1024"/>
+          <w:numId w:val="1026"/>
         </w:numPr>
         <w:pStyle w:val="Compact"/>
       </w:pPr>
@@ -2853,6 +2895,12 @@
     <w:abstractNumId w:val="991"/>
   </w:num>
   <w:num w:numId="1024">
+    <w:abstractNumId w:val="991"/>
+  </w:num>
+  <w:num w:numId="1025">
+    <w:abstractNumId w:val="991"/>
+  </w:num>
+  <w:num w:numId="1026">
     <w:abstractNumId w:val="991"/>
   </w:num>
 </w:numbering>

</xml_diff>

<commit_message>
publish student projects 2026-07-27 21:38
</commit_message>
<xml_diff>
--- a/Education-Training/pocket-money-academy.docx
+++ b/Education-Training/pocket-money-academy.docx
@@ -2526,7 +2526,19 @@
         <w:pStyle w:val="Compact"/>
       </w:pPr>
       <w:r>
-        <w:t xml:space="preserve">TA1 ⭐ Audio Direction &amp; Plan — playful but focus-friendly; correct/incorrect/progress cues designed for kids</w:t>
+        <w:t xml:space="preserve">TA1 ⭐ Overall Audio Experience — initial BGM/SFX from the week-5 needs list present and working in the prototype, suitable and correctly triggered for this project.</w:t>
+      </w:r>
+    </w:p>
+    <w:p>
+      <w:pPr>
+        <w:numPr>
+          <w:ilvl w:val="1"/>
+          <w:numId w:val="1025"/>
+        </w:numPr>
+        <w:pStyle w:val="Compact"/>
+      </w:pPr>
+      <w:r>
+        <w:t xml:space="preserve">TA2 ⭐ Audio Engine Functionality — data-driven audio pipeline (add or replace audio without recompiling) and reliable multi-channel playback.</w:t>
       </w:r>
     </w:p>
     <w:p>
@@ -2553,7 +2565,19 @@
         <w:pStyle w:val="Compact"/>
       </w:pPr>
       <w:r>
-        <w:t xml:space="preserve">TA1 ⭐ Audio Integration &amp; Quality — Education floor: ≥1 BGM (focus-friendly, non-distracting) + ≥6 SFX with distinct correct/incorrect/progress cues mandatory</w:t>
+        <w:t xml:space="preserve">TA1 ⭐ Overall Audio Experience — Education floor: ≥1 BGM (focus-friendly, non-distracting) + ≥6 SFX with distinct correct/incorrect/progress cues mandatory</w:t>
+      </w:r>
+    </w:p>
+    <w:p>
+      <w:pPr>
+        <w:numPr>
+          <w:ilvl w:val="1"/>
+          <w:numId w:val="1026"/>
+        </w:numPr>
+        <w:pStyle w:val="Compact"/>
+      </w:pPr>
+      <w:r>
+        <w:t xml:space="preserve">TA2 ⭐ Audio Engine Functionality — audio properties de/serialised and the full playback functionality the build needs (multi-channel; advanced where the project calls for it).</w:t>
       </w:r>
     </w:p>
     <w:p>

</xml_diff>